<commit_message>
add production readiness audits
</commit_message>
<xml_diff>
--- a/deliverables/03_开发与部署文档.docx
+++ b/deliverables/03_开发与部署文档.docx
@@ -26,7 +26,7 @@
           <w:color w:val="464A50"/>
           <w:sz w:val="26"/>
         </w:rPr>
-        <w:t>Evidence-to-Alpha v0.4.0</w:t>
+        <w:t>Evidence-to-Alpha v0.5.0</w:t>
       </w:r>
     </w:p>
     <w:p>
@@ -70,7 +70,7 @@
           <w:color w:val="23262B"/>
           <w:sz w:val="21"/>
         </w:rPr>
-        <w:t>v0.4.0 Integrated Validation</w:t>
+        <w:t>v0.5.0 Real-Data Readiness Preflight</w:t>
       </w:r>
     </w:p>
     <w:p>
@@ -114,7 +114,7 @@
           <w:color w:val="23262B"/>
           <w:sz w:val="21"/>
         </w:rPr>
-        <w:t>集成独立验证和本地只读部署已验证；Live 阻断</w:t>
+        <w:t>真实数据预检机制已验证；真实输入和 Live 仍阻断</w:t>
       </w:r>
     </w:p>
     <w:p>
@@ -730,7 +730,7 @@
                 <w:rFonts w:ascii="Calibri" w:hAnsi="Calibri" w:eastAsia="Microsoft YaHei"/>
                 <w:sz w:val="19"/>
               </w:rPr>
-              <w:t>只读 artifact 服务和可复现命令</w:t>
+              <w:t>只读 artifact 服务、inspect-panel、readiness 和可复现命令</w:t>
             </w:r>
           </w:p>
         </w:tc>
@@ -1251,7 +1251,7 @@
                 <w:rFonts w:ascii="Calibri" w:hAnsi="Calibri" w:eastAsia="Microsoft YaHei"/>
                 <w:sz w:val="19"/>
               </w:rPr>
-              <w:t>date,ticker,adj_close 或 date + ticker columns</w:t>
+              <w:t>date,ticker,adj_close/total_return_index 或宽表</w:t>
             </w:r>
           </w:p>
         </w:tc>
@@ -1816,6 +1816,100 @@
                 <w:sz w:val="19"/>
               </w:rPr>
               <w:t>python -m evidence_alpha news-export --news-base-url http://127.0.0.1:8765 --output-dir artifacts/news</w:t>
+            </w:r>
+          </w:p>
+        </w:tc>
+      </w:tr>
+      <w:tr>
+        <w:trPr>
+          <w:cantSplit/>
+        </w:trPr>
+        <w:tc>
+          <w:tcPr>
+            <w:tcW w:type="dxa" w:w="1900"/>
+            <w:tcMar>
+              <w:top w:w="80" w:type="dxa"/>
+              <w:start w:w="120" w:type="dxa"/>
+              <w:bottom w:w="80" w:type="dxa"/>
+              <w:end w:w="120" w:type="dxa"/>
+            </w:tcMar>
+            <w:vAlign w:val="center"/>
+          </w:tcPr>
+          <w:p>
+            <w:r>
+              <w:rPr>
+                <w:rFonts w:ascii="Calibri" w:hAnsi="Calibri" w:eastAsia="Microsoft YaHei"/>
+                <w:sz w:val="19"/>
+              </w:rPr>
+              <w:t>市场输入检查</w:t>
+            </w:r>
+          </w:p>
+        </w:tc>
+        <w:tc>
+          <w:tcPr>
+            <w:tcW w:type="dxa" w:w="7460"/>
+            <w:tcMar>
+              <w:top w:w="80" w:type="dxa"/>
+              <w:start w:w="120" w:type="dxa"/>
+              <w:bottom w:w="80" w:type="dxa"/>
+              <w:end w:w="120" w:type="dxa"/>
+            </w:tcMar>
+            <w:vAlign w:val="center"/>
+          </w:tcPr>
+          <w:p>
+            <w:r>
+              <w:rPr>
+                <w:rFonts w:ascii="Calibri" w:hAnsi="Calibri" w:eastAsia="Microsoft YaHei"/>
+                <w:sz w:val="19"/>
+              </w:rPr>
+              <w:t>python -m evidence_alpha inspect-panel --input &lt;file&gt; --kind &lt;factor_weights|adjusted_prices&gt;</w:t>
+            </w:r>
+          </w:p>
+        </w:tc>
+      </w:tr>
+      <w:tr>
+        <w:trPr>
+          <w:cantSplit/>
+        </w:trPr>
+        <w:tc>
+          <w:tcPr>
+            <w:tcW w:type="dxa" w:w="1900"/>
+            <w:tcMar>
+              <w:top w:w="80" w:type="dxa"/>
+              <w:start w:w="120" w:type="dxa"/>
+              <w:bottom w:w="80" w:type="dxa"/>
+              <w:end w:w="120" w:type="dxa"/>
+            </w:tcMar>
+            <w:vAlign w:val="center"/>
+          </w:tcPr>
+          <w:p>
+            <w:r>
+              <w:rPr>
+                <w:rFonts w:ascii="Calibri" w:hAnsi="Calibri" w:eastAsia="Microsoft YaHei"/>
+                <w:sz w:val="19"/>
+              </w:rPr>
+              <w:t>发布就绪检查</w:t>
+            </w:r>
+          </w:p>
+        </w:tc>
+        <w:tc>
+          <w:tcPr>
+            <w:tcW w:type="dxa" w:w="7460"/>
+            <w:tcMar>
+              <w:top w:w="80" w:type="dxa"/>
+              <w:start w:w="120" w:type="dxa"/>
+              <w:bottom w:w="80" w:type="dxa"/>
+              <w:end w:w="120" w:type="dxa"/>
+            </w:tcMar>
+            <w:vAlign w:val="center"/>
+          </w:tcPr>
+          <w:p>
+            <w:r>
+              <w:rPr>
+                <w:rFonts w:ascii="Calibri" w:hAnsi="Calibri" w:eastAsia="Microsoft YaHei"/>
+                <w:sz w:val="19"/>
+              </w:rPr>
+              <w:t>python -m evidence_alpha readiness --artifact-dir &lt;integrated&gt; --pb-ingestion-manifest &lt;manifest&gt; ...</w:t>
             </w:r>
           </w:p>
         </w:tc>
@@ -2472,7 +2566,7 @@
         <w:rPr>
           <w:rFonts w:ascii="Calibri" w:hAnsi="Calibri" w:eastAsia="Microsoft YaHei"/>
         </w:rPr>
-        <w:t>22/22 unittest 通过；ResourceWarning 按错误处理后仍为零。</w:t>
+        <w:t>63/63 unittest 和 8 个 subtest 通过；所有 warning 按错误处理后仍为零。</w:t>
       </w:r>
     </w:p>
     <w:p>
@@ -2559,6 +2653,69 @@
           <w:i w:val="0"/>
         </w:rPr>
         <w:t>三日 synthetic 夹具产生的年化、Sharpe 和换手没有统计意义，只证明接口和执行流程。5 日主窗口仍无可用事件，当前研究决策为 INCONCLUSIVE。</w:t>
+      </w:r>
+    </w:p>
+    <w:p>
+      <w:pPr>
+        <w:pStyle w:val="Heading2"/>
+      </w:pPr>
+      <w:r>
+        <w:t>8.1 v0.5 真实数据门禁</w:t>
+      </w:r>
+    </w:p>
+    <w:p>
+      <w:pPr>
+        <w:pStyle w:val="ListBullet"/>
+      </w:pPr>
+      <w:r>
+        <w:rPr>
+          <w:rFonts w:ascii="Calibri" w:hAnsi="Calibri" w:eastAsia="Microsoft YaHei"/>
+        </w:rPr>
+        <w:t>readiness 重新读取 CSV/Parquet，核对内容覆盖、字段语义、非有限值、重复记录和 SHA-256。</w:t>
+      </w:r>
+    </w:p>
+    <w:p>
+      <w:pPr>
+        <w:pStyle w:val="ListBullet"/>
+      </w:pPr>
+      <w:r>
+        <w:rPr>
+          <w:rFonts w:ascii="Calibri" w:hAnsi="Calibri" w:eastAsia="Microsoft YaHei"/>
+        </w:rPr>
+        <w:t>PB 必须提交真实来源摄取清单；来源、映射、规范化文件哈希全部校验，规范化哈希还要与 validation、dry run、launch bundle 四方一致。</w:t>
+      </w:r>
+    </w:p>
+    <w:p>
+      <w:pPr>
+        <w:pStyle w:val="ListBullet"/>
+      </w:pPr>
+      <w:r>
+        <w:rPr>
+          <w:rFonts w:ascii="Calibri" w:hAnsi="Calibri" w:eastAsia="Microsoft YaHei"/>
+        </w:rPr>
+        <w:t>当前真实 V6.5 权重截至 2026-07-17；显式 adj_close 面板截至 2024-12-31；较新的 TDX 数据为 raw close。</w:t>
+      </w:r>
+    </w:p>
+    <w:p>
+      <w:pPr>
+        <w:pStyle w:val="ListBullet"/>
+      </w:pPr>
+      <w:r>
+        <w:rPr>
+          <w:rFonts w:ascii="Calibri" w:hAnsi="Calibri" w:eastAsia="Microsoft YaHei"/>
+        </w:rPr>
+        <w:t>当前 200 个真实事件均晚于可用市场输入，且缺少稳定 novelty、PIT ticker mapping、真实 PB 和连续 20 个 Paper session。</w:t>
+      </w:r>
+    </w:p>
+    <w:p>
+      <w:pPr>
+        <w:pStyle w:val="ListBullet"/>
+      </w:pPr>
+      <w:r>
+        <w:rPr>
+          <w:rFonts w:ascii="Calibri" w:hAnsi="Calibri" w:eastAsia="Microsoft YaHei"/>
+        </w:rPr>
+        <w:t>封存 readiness 为 BLOCKED：23 个硬失败、0 个主窗口样本、0 个 OOS 样本、0 个验证 Paper session。</w:t>
       </w:r>
     </w:p>
     <w:p>
@@ -2995,7 +3152,7 @@
                 <w:rFonts w:ascii="Calibri" w:hAnsi="Calibri" w:eastAsia="Microsoft YaHei"/>
                 <w:sz w:val="19"/>
               </w:rPr>
-              <w:t>真实 feed + dry-run manifest + acceptance gate</w:t>
+              <w:t>真实来源摄取清单 + 四方哈希一致 + validation/dry-run/launch gate</w:t>
             </w:r>
           </w:p>
         </w:tc>
@@ -3191,7 +3348,7 @@
         <w:rPr>
           <w:rFonts w:ascii="Calibri" w:hAnsi="Calibri" w:eastAsia="Microsoft YaHei"/>
         </w:rPr>
-        <w:t>私有 GitHub 合并和本地只读部署在本轮授权内；云发布、券商和实盘仍需单独授权。</w:t>
+        <w:t>私有 GitHub 发布、合并、标签和 v0.4 替换都必须等待同一真实运行通过全部 readiness 硬门禁。</w:t>
       </w:r>
     </w:p>
     <w:sectPr>
@@ -3219,7 +3376,7 @@
         <w:color w:val="646A74"/>
         <w:sz w:val="18"/>
       </w:rPr>
-      <w:t xml:space="preserve">v0.4.0 | Internal research document | Page </w:t>
+      <w:t xml:space="preserve">v0.5.0 | Internal research document | Page </w:t>
     </w:r>
     <w:fldSimple w:instr="PAGE">
       <w:r>

</xml_diff>